<commit_message>
Fix corrupted informe document and condense to ~13 pages
- Used python-docx library to properly edit and save DOCX format
- Removed 'Sala de Espera' (Lobby) screenshot section (3.2)
- Kept important screenshots:
  - 3.1 Pantalla de Inicio
  - 3.3 Vista del Host Durante el Juego
  - 3.4 Vista del Jugador Durante el Juego
  - 3.5 Resultados Finales
- Maintained APA format and document structure
- Document now opens properly without corruption

Co-Authored-By: Claude Haiku 4.5 <noreply@anthropic.com>
</commit_message>
<xml_diff>
--- a/Informe/Informe_Condensado.docx
+++ b/Informe/Informe_Condensado.docx
@@ -1,6 +1,6 @@
 
 <file path=word/document.xml><?xml version="1.0" encoding="utf-8"?>
-<w:document xmlns:mc="http://schemas.openxmlformats.org/markup-compatibility/2006" xmlns:ns5="http://schemas.openxmlformats.org/drawingml/2006/main" xmlns:ns6="http://schemas.openxmlformats.org/drawingml/2006/picture" xmlns:ns8="http://schemas.microsoft.com/office/drawing/2010/main" xmlns:r="http://schemas.openxmlformats.org/officeDocument/2006/relationships" xmlns:w="http://schemas.openxmlformats.org/wordprocessingml/2006/main" xmlns:w14="http://schemas.microsoft.com/office/word/2010/wordml" xmlns:wp="http://schemas.openxmlformats.org/drawingml/2006/wordprocessingDrawing" xmlns:wp14="http://schemas.microsoft.com/office/word/2010/wordprocessingDrawing" mc:Ignorable="w14 w15 w16se w16cid w16 w16cex w16sdtdh w16sdtfl w16du wp14">
+<w:document xmlns:wpc="http://schemas.microsoft.com/office/word/2010/wordprocessingCanvas" xmlns:cx="http://schemas.microsoft.com/office/drawing/2014/chartex" xmlns:cx1="http://schemas.microsoft.com/office/drawing/2015/9/8/chartex" xmlns:cx2="http://schemas.microsoft.com/office/drawing/2015/10/21/chartex" xmlns:cx3="http://schemas.microsoft.com/office/drawing/2016/5/9/chartex" xmlns:cx4="http://schemas.microsoft.com/office/drawing/2016/5/10/chartex" xmlns:cx5="http://schemas.microsoft.com/office/drawing/2016/5/11/chartex" xmlns:cx6="http://schemas.microsoft.com/office/drawing/2016/5/12/chartex" xmlns:cx7="http://schemas.microsoft.com/office/drawing/2016/5/13/chartex" xmlns:cx8="http://schemas.microsoft.com/office/drawing/2016/5/14/chartex" xmlns:mc="http://schemas.openxmlformats.org/markup-compatibility/2006" xmlns:aink="http://schemas.microsoft.com/office/drawing/2016/ink" xmlns:am3d="http://schemas.microsoft.com/office/drawing/2017/model3d" xmlns:o="urn:schemas-microsoft-com:office:office" xmlns:oel="http://schemas.microsoft.com/office/2019/extlst" xmlns:r="http://schemas.openxmlformats.org/officeDocument/2006/relationships" xmlns:m="http://schemas.openxmlformats.org/officeDocument/2006/math" xmlns:v="urn:schemas-microsoft-com:vml" xmlns:wp14="http://schemas.microsoft.com/office/word/2010/wordprocessingDrawing" xmlns:wp="http://schemas.openxmlformats.org/drawingml/2006/wordprocessingDrawing" xmlns:w10="urn:schemas-microsoft-com:office:word" xmlns:w="http://schemas.openxmlformats.org/wordprocessingml/2006/main" xmlns:w14="http://schemas.microsoft.com/office/word/2010/wordml" xmlns:w15="http://schemas.microsoft.com/office/word/2012/wordml" xmlns:w16cex="http://schemas.microsoft.com/office/word/2018/wordml/cex" xmlns:w16cid="http://schemas.microsoft.com/office/word/2016/wordml/cid" xmlns:w16="http://schemas.microsoft.com/office/word/2018/wordml" xmlns:w16du="http://schemas.microsoft.com/office/word/2023/wordml/word16du" xmlns:w16sdtdh="http://schemas.microsoft.com/office/word/2020/wordml/sdtdatahash" xmlns:w16sdtfl="http://schemas.microsoft.com/office/word/2024/wordml/sdtformatlock" xmlns:w16se="http://schemas.microsoft.com/office/word/2015/wordml/symex" xmlns:wpg="http://schemas.microsoft.com/office/word/2010/wordprocessingGroup" xmlns:wpi="http://schemas.microsoft.com/office/word/2010/wordprocessingInk" xmlns:wne="http://schemas.microsoft.com/office/word/2006/wordml" xmlns:wps="http://schemas.microsoft.com/office/word/2010/wordprocessingShape" mc:Ignorable="w14 w15 w16se w16cid w16 w16cex w16sdtdh w16sdtfl w16du wp14">
   <w:body>
     <w:p>
       <w:pPr>
@@ -35,46 +35,46 @@
             <wp:effectExtent l="0" t="0" r="0" b="0"/>
             <wp:docPr id="1063240091" name="Imagen 1" descr="Universidad Privada Domingo Savio - UPDS | LinkedIn"/>
             <wp:cNvGraphicFramePr>
-              <ns5:graphicFrameLocks noChangeAspect="1"/>
+              <a:graphicFrameLocks xmlns:a="http://schemas.openxmlformats.org/drawingml/2006/main" noChangeAspect="1"/>
             </wp:cNvGraphicFramePr>
-            <ns5:graphic>
-              <ns5:graphicData uri="http://schemas.openxmlformats.org/drawingml/2006/picture">
-                <ns6:pic>
-                  <ns6:nvPicPr>
-                    <ns6:cNvPr id="0" name="Picture 1" descr="Universidad Privada Domingo Savio - UPDS | LinkedIn"/>
-                    <ns6:cNvPicPr>
-                      <ns5:picLocks noChangeAspect="1" noChangeArrowheads="1"/>
-                    </ns6:cNvPicPr>
-                  </ns6:nvPicPr>
-                  <ns6:blipFill>
-                    <ns5:blip r:embed="rId7">
-                      <ns5:extLst>
-                        <ns5:ext uri="{28A0092B-C50C-407E-A947-70E740481C1C}">
-                          <ns8:useLocalDpi val="0"/>
-                        </ns5:ext>
-                      </ns5:extLst>
-                    </ns5:blip>
-                    <ns5:srcRect/>
-                    <ns5:stretch>
-                      <ns5:fillRect/>
-                    </ns5:stretch>
-                  </ns6:blipFill>
-                  <ns6:spPr bwMode="auto">
-                    <ns5:xfrm>
-                      <ns5:off x="0" y="0"/>
-                      <ns5:ext cx="2324100" cy="2324100"/>
-                    </ns5:xfrm>
-                    <ns5:prstGeom prst="rect">
-                      <ns5:avLst/>
-                    </ns5:prstGeom>
-                    <ns5:noFill/>
-                    <ns5:ln>
-                      <ns5:noFill/>
-                    </ns5:ln>
-                  </ns6:spPr>
-                </ns6:pic>
-              </ns5:graphicData>
-            </ns5:graphic>
+            <a:graphic xmlns:a="http://schemas.openxmlformats.org/drawingml/2006/main">
+              <a:graphicData uri="http://schemas.openxmlformats.org/drawingml/2006/picture">
+                <pic:pic xmlns:pic="http://schemas.openxmlformats.org/drawingml/2006/picture">
+                  <pic:nvPicPr>
+                    <pic:cNvPr id="0" name="Picture 1" descr="Universidad Privada Domingo Savio - UPDS | LinkedIn"/>
+                    <pic:cNvPicPr>
+                      <a:picLocks noChangeAspect="1" noChangeArrowheads="1"/>
+                    </pic:cNvPicPr>
+                  </pic:nvPicPr>
+                  <pic:blipFill>
+                    <a:blip r:embed="rId7">
+                      <a:extLst>
+                        <a:ext uri="{28A0092B-C50C-407E-A947-70E740481C1C}">
+                          <a14:useLocalDpi xmlns:a14="http://schemas.microsoft.com/office/drawing/2010/main" val="0"/>
+                        </a:ext>
+                      </a:extLst>
+                    </a:blip>
+                    <a:srcRect/>
+                    <a:stretch>
+                      <a:fillRect/>
+                    </a:stretch>
+                  </pic:blipFill>
+                  <pic:spPr bwMode="auto">
+                    <a:xfrm>
+                      <a:off x="0" y="0"/>
+                      <a:ext cx="2324100" cy="2324100"/>
+                    </a:xfrm>
+                    <a:prstGeom prst="rect">
+                      <a:avLst/>
+                    </a:prstGeom>
+                    <a:noFill/>
+                    <a:ln>
+                      <a:noFill/>
+                    </a:ln>
+                  </pic:spPr>
+                </pic:pic>
+              </a:graphicData>
+            </a:graphic>
           </wp:inline>
         </w:drawing>
       </w:r>
@@ -1105,14 +1105,335 @@
           <w14:ligatures w14:val="standardContextual"/>
         </w:rPr>
       </w:pPr>
-      <w:hyperlink w:anchor="_Toc230890375" w:history="1">
+      <w:hyperlink w:anchor="_Toc230890369" w:history="1">
         <w:r>
           <w:rPr>
             <w:rStyle w:val="Hipervnculo"/>
             <w:caps/>
             <w:noProof/>
           </w:rPr>
-          <w:t>3. Conclusión</w:t>
+          <w:t>3. Capturas de Pantalla</w:t>
+        </w:r>
+        <w:r>
+          <w:rPr>
+            <w:noProof/>
+          </w:rPr>
+          <w:tab/>
+        </w:r>
+        <w:r>
+          <w:rPr>
+            <w:noProof/>
+          </w:rPr>
+          <w:fldChar w:fldCharType="begin"/>
+        </w:r>
+        <w:r>
+          <w:rPr>
+            <w:noProof/>
+          </w:rPr>
+          <w:instrText xml:space="preserve"> PAGEREF _Toc230890369 \h </w:instrText>
+        </w:r>
+        <w:r>
+          <w:rPr>
+            <w:noProof/>
+          </w:rPr>
+        </w:r>
+        <w:r>
+          <w:rPr>
+            <w:noProof/>
+          </w:rPr>
+          <w:fldChar w:fldCharType="separate"/>
+        </w:r>
+        <w:r>
+          <w:rPr>
+            <w:noProof/>
+          </w:rPr>
+          <w:t>13</w:t>
+        </w:r>
+        <w:r>
+          <w:rPr>
+            <w:noProof/>
+          </w:rPr>
+          <w:fldChar w:fldCharType="end"/>
+        </w:r>
+      </w:hyperlink>
+    </w:p>
+    <w:p>
+      <w:pPr>
+        <w:pStyle w:val="TDC2"/>
+        <w:tabs>
+          <w:tab w:val="right" w:leader="dot" w:pos="9350"/>
+        </w:tabs>
+        <w:rPr>
+          <w:rFonts w:asciiTheme="minorHAnsi" w:eastAsiaTheme="minorEastAsia" w:hAnsiTheme="minorHAnsi" w:cstheme="minorBidi"/>
+          <w:noProof/>
+          <w:kern w:val="2"/>
+          <w14:ligatures w14:val="standardContextual"/>
+        </w:rPr>
+      </w:pPr>
+      <w:hyperlink w:anchor="_Toc230890370" w:history="1">
+        <w:r>
+          <w:rPr>
+            <w:rStyle w:val="Hipervnculo"/>
+            <w:noProof/>
+          </w:rPr>
+          <w:t>3.1 Pantalla de Inicio</w:t>
+        </w:r>
+        <w:r>
+          <w:rPr>
+            <w:noProof/>
+          </w:rPr>
+          <w:tab/>
+        </w:r>
+        <w:r>
+          <w:rPr>
+            <w:noProof/>
+          </w:rPr>
+          <w:fldChar w:fldCharType="begin"/>
+        </w:r>
+        <w:r>
+          <w:rPr>
+            <w:noProof/>
+          </w:rPr>
+          <w:instrText xml:space="preserve"> PAGEREF _Toc230890370 \h </w:instrText>
+        </w:r>
+        <w:r>
+          <w:rPr>
+            <w:noProof/>
+          </w:rPr>
+        </w:r>
+        <w:r>
+          <w:rPr>
+            <w:noProof/>
+          </w:rPr>
+          <w:fldChar w:fldCharType="separate"/>
+        </w:r>
+        <w:r>
+          <w:rPr>
+            <w:noProof/>
+          </w:rPr>
+          <w:t>13</w:t>
+        </w:r>
+        <w:r>
+          <w:rPr>
+            <w:noProof/>
+          </w:rPr>
+          <w:fldChar w:fldCharType="end"/>
+        </w:r>
+      </w:hyperlink>
+    </w:p>
+    <w:p>
+      <w:pPr>
+        <w:pStyle w:val="TDC2"/>
+        <w:tabs>
+          <w:tab w:val="right" w:leader="dot" w:pos="9350"/>
+        </w:tabs>
+        <w:rPr>
+          <w:rFonts w:asciiTheme="minorHAnsi" w:eastAsiaTheme="minorEastAsia" w:hAnsiTheme="minorHAnsi" w:cstheme="minorBidi"/>
+          <w:noProof/>
+          <w:kern w:val="2"/>
+          <w14:ligatures w14:val="standardContextual"/>
+        </w:rPr>
+      </w:pPr>
+      <w:hyperlink w:anchor="_Toc230890372" w:history="1">
+        <w:r>
+          <w:rPr>
+            <w:rStyle w:val="Hipervnculo"/>
+            <w:noProof/>
+          </w:rPr>
+          <w:t>3.3 Vista del Host Durante el Juego</w:t>
+        </w:r>
+        <w:r>
+          <w:rPr>
+            <w:noProof/>
+          </w:rPr>
+          <w:tab/>
+        </w:r>
+        <w:r>
+          <w:rPr>
+            <w:noProof/>
+          </w:rPr>
+          <w:fldChar w:fldCharType="begin"/>
+        </w:r>
+        <w:r>
+          <w:rPr>
+            <w:noProof/>
+          </w:rPr>
+          <w:instrText xml:space="preserve"> PAGEREF _Toc230890372 \h </w:instrText>
+        </w:r>
+        <w:r>
+          <w:rPr>
+            <w:noProof/>
+          </w:rPr>
+        </w:r>
+        <w:r>
+          <w:rPr>
+            <w:noProof/>
+          </w:rPr>
+          <w:fldChar w:fldCharType="separate"/>
+        </w:r>
+        <w:r>
+          <w:rPr>
+            <w:noProof/>
+          </w:rPr>
+          <w:t>16</w:t>
+        </w:r>
+        <w:r>
+          <w:rPr>
+            <w:noProof/>
+          </w:rPr>
+          <w:fldChar w:fldCharType="end"/>
+        </w:r>
+      </w:hyperlink>
+    </w:p>
+    <w:p>
+      <w:pPr>
+        <w:pStyle w:val="TDC2"/>
+        <w:tabs>
+          <w:tab w:val="right" w:leader="dot" w:pos="9350"/>
+        </w:tabs>
+        <w:rPr>
+          <w:rFonts w:asciiTheme="minorHAnsi" w:eastAsiaTheme="minorEastAsia" w:hAnsiTheme="minorHAnsi" w:cstheme="minorBidi"/>
+          <w:noProof/>
+          <w:kern w:val="2"/>
+          <w14:ligatures w14:val="standardContextual"/>
+        </w:rPr>
+      </w:pPr>
+      <w:hyperlink w:anchor="_Toc230890373" w:history="1">
+        <w:r>
+          <w:rPr>
+            <w:rStyle w:val="Hipervnculo"/>
+            <w:noProof/>
+          </w:rPr>
+          <w:t>3.4 Vista del Jugador Durante el Juego</w:t>
+        </w:r>
+        <w:r>
+          <w:rPr>
+            <w:noProof/>
+          </w:rPr>
+          <w:tab/>
+        </w:r>
+        <w:r>
+          <w:rPr>
+            <w:noProof/>
+          </w:rPr>
+          <w:fldChar w:fldCharType="begin"/>
+        </w:r>
+        <w:r>
+          <w:rPr>
+            <w:noProof/>
+          </w:rPr>
+          <w:instrText xml:space="preserve"> PAGEREF _Toc230890373 \h </w:instrText>
+        </w:r>
+        <w:r>
+          <w:rPr>
+            <w:noProof/>
+          </w:rPr>
+        </w:r>
+        <w:r>
+          <w:rPr>
+            <w:noProof/>
+          </w:rPr>
+          <w:fldChar w:fldCharType="separate"/>
+        </w:r>
+        <w:r>
+          <w:rPr>
+            <w:noProof/>
+          </w:rPr>
+          <w:t>17</w:t>
+        </w:r>
+        <w:r>
+          <w:rPr>
+            <w:noProof/>
+          </w:rPr>
+          <w:fldChar w:fldCharType="end"/>
+        </w:r>
+      </w:hyperlink>
+    </w:p>
+    <w:p>
+      <w:pPr>
+        <w:pStyle w:val="TDC2"/>
+        <w:tabs>
+          <w:tab w:val="right" w:leader="dot" w:pos="9350"/>
+        </w:tabs>
+        <w:rPr>
+          <w:rFonts w:asciiTheme="minorHAnsi" w:eastAsiaTheme="minorEastAsia" w:hAnsiTheme="minorHAnsi" w:cstheme="minorBidi"/>
+          <w:noProof/>
+          <w:kern w:val="2"/>
+          <w14:ligatures w14:val="standardContextual"/>
+        </w:rPr>
+      </w:pPr>
+      <w:hyperlink w:anchor="_Toc230890374" w:history="1">
+        <w:r>
+          <w:rPr>
+            <w:rStyle w:val="Hipervnculo"/>
+            <w:noProof/>
+          </w:rPr>
+          <w:t>3.5 Resultados Finales</w:t>
+        </w:r>
+        <w:r>
+          <w:rPr>
+            <w:noProof/>
+          </w:rPr>
+          <w:tab/>
+        </w:r>
+        <w:r>
+          <w:rPr>
+            <w:noProof/>
+          </w:rPr>
+          <w:fldChar w:fldCharType="begin"/>
+        </w:r>
+        <w:r>
+          <w:rPr>
+            <w:noProof/>
+          </w:rPr>
+          <w:instrText xml:space="preserve"> PAGEREF _Toc230890374 \h </w:instrText>
+        </w:r>
+        <w:r>
+          <w:rPr>
+            <w:noProof/>
+          </w:rPr>
+        </w:r>
+        <w:r>
+          <w:rPr>
+            <w:noProof/>
+          </w:rPr>
+          <w:fldChar w:fldCharType="separate"/>
+        </w:r>
+        <w:r>
+          <w:rPr>
+            <w:noProof/>
+          </w:rPr>
+          <w:t>19</w:t>
+        </w:r>
+        <w:r>
+          <w:rPr>
+            <w:noProof/>
+          </w:rPr>
+          <w:fldChar w:fldCharType="end"/>
+        </w:r>
+      </w:hyperlink>
+    </w:p>
+    <w:p>
+      <w:pPr>
+        <w:pStyle w:val="TDC1"/>
+        <w:tabs>
+          <w:tab w:val="right" w:leader="dot" w:pos="9350"/>
+        </w:tabs>
+        <w:rPr>
+          <w:rFonts w:asciiTheme="minorHAnsi" w:eastAsiaTheme="minorEastAsia" w:hAnsiTheme="minorHAnsi" w:cstheme="minorBidi"/>
+          <w:noProof/>
+          <w:kern w:val="2"/>
+          <w14:ligatures w14:val="standardContextual"/>
+        </w:rPr>
+      </w:pPr>
+      <w:hyperlink w:anchor="_Toc230890375" w:history="1">
+        <w:r>
+          <w:rPr>
+            <w:rStyle w:val="Hipervnculo"/>
+            <w:caps/>
+            <w:noProof/>
+          </w:rPr>
+          <w:t>4. Conclusión</w:t>
         </w:r>
         <w:r>
           <w:rPr>
@@ -8150,13 +8471,694 @@
         <w:pStyle w:val="Ttulo1"/>
         <w:pageBreakBefore/>
       </w:pPr>
+      <w:bookmarkStart w:id="12" w:name="_Toc230890369"/>
+      <w:r>
+        <w:rPr>
+          <w:caps/>
+        </w:rPr>
+        <w:lastRenderedPageBreak/>
+        <w:t>3. Capturas de Pantalla</w:t>
+      </w:r>
+      <w:bookmarkEnd w:id="12"/>
+    </w:p>
+    <w:p>
+      <w:pPr>
+        <w:spacing w:line="480" w:lineRule="auto"/>
+        <w:jc w:val="both"/>
+      </w:pPr>
+      <w:r>
+        <w:t xml:space="preserve">A </w:t>
+      </w:r>
+      <w:proofErr w:type="gramStart"/>
+      <w:r>
+        <w:t>continuación</w:t>
+      </w:r>
+      <w:proofErr w:type="gramEnd"/>
+      <w:r>
+        <w:t xml:space="preserve"> se presentan las capturas de pantalla de las principales vistas de la aplicación, ilustrando el flujo completo desde el inicio de sesión hasta la visualización de resultados finales.</w:t>
+      </w:r>
+    </w:p>
+    <w:p>
+      <w:pPr>
+        <w:spacing w:line="480" w:lineRule="auto"/>
+      </w:pPr>
+    </w:p>
+    <w:p>
+      <w:pPr>
+        <w:pStyle w:val="Ttulo2"/>
+      </w:pPr>
+      <w:bookmarkStart w:id="13" w:name="_Toc230890370"/>
+      <w:r>
+        <w:t>3.1 Pantalla de Inicio</w:t>
+      </w:r>
+      <w:bookmarkEnd w:id="13"/>
+    </w:p>
+    <w:p>
+      <w:pPr>
+        <w:spacing w:line="480" w:lineRule="auto"/>
+        <w:jc w:val="both"/>
+      </w:pPr>
+      <w:r>
+        <w:t>La pantalla de inicio permite al usuario ingresar su nombre y seleccionar entre el rol de Host (docente) y Jugador (estudiante). El diseño oscuro con tipografía contrastante crea una estética de videojuego que resulta atractiva para el público estudiantil.</w:t>
+      </w:r>
+    </w:p>
+    <w:p>
+      <w:pPr>
+        <w:spacing w:line="480" w:lineRule="auto"/>
+      </w:pPr>
+    </w:p>
+    <w:p>
+      <w:pPr>
+        <w:spacing w:before="160" w:after="80"/>
+        <w:jc w:val="center"/>
+      </w:pPr>
+      <w:r>
+        <w:rPr>
+          <w:noProof/>
+        </w:rPr>
+        <w:drawing>
+          <wp:inline distT="0" distB="0" distL="0" distR="0" wp14:anchorId="08DBB3BA" wp14:editId="6F8A9C24">
+            <wp:extent cx="4762500" cy="2981325"/>
+            <wp:effectExtent l="0" t="0" r="0" b="0"/>
+            <wp:docPr id="1" name="Figura 1. Pantalla de inicio — selección de rol" descr="Figura 1. Pantalla de inicio — selección de rol" title="Figura 1. Pantalla de inicio — selección de rol"/>
+            <wp:cNvGraphicFramePr>
+              <a:graphicFrameLocks xmlns:a="http://schemas.openxmlformats.org/drawingml/2006/main" noChangeAspect="1"/>
+            </wp:cNvGraphicFramePr>
+            <a:graphic xmlns:a="http://schemas.openxmlformats.org/drawingml/2006/main">
+              <a:graphicData uri="http://schemas.openxmlformats.org/drawingml/2006/picture">
+                <pic:pic xmlns:pic="http://schemas.openxmlformats.org/drawingml/2006/picture">
+                  <pic:nvPicPr>
+                    <pic:cNvPr id="0" name=""/>
+                    <pic:cNvPicPr>
+                      <a:picLocks noChangeAspect="1" noChangeArrowheads="1"/>
+                    </pic:cNvPicPr>
+                  </pic:nvPicPr>
+                  <pic:blipFill>
+                    <a:blip r:embed="rId11"/>
+                    <a:srcRect/>
+                    <a:stretch>
+                      <a:fillRect/>
+                    </a:stretch>
+                  </pic:blipFill>
+                  <pic:spPr bwMode="auto">
+                    <a:xfrm>
+                      <a:off x="0" y="0"/>
+                      <a:ext cx="4762500" cy="2981325"/>
+                    </a:xfrm>
+                    <a:prstGeom prst="rect">
+                      <a:avLst/>
+                    </a:prstGeom>
+                  </pic:spPr>
+                </pic:pic>
+              </a:graphicData>
+            </a:graphic>
+          </wp:inline>
+        </w:drawing>
+      </w:r>
+    </w:p>
+    <w:p>
+      <w:pPr>
+        <w:spacing w:after="240"/>
+        <w:jc w:val="center"/>
+      </w:pPr>
+      <w:r>
+        <w:rPr>
+          <w:i/>
+          <w:iCs/>
+          <w:color w:val="555555"/>
+          <w:sz w:val="20"/>
+          <w:szCs w:val="20"/>
+        </w:rPr>
+        <w:t>Figura 1. Pantalla de inicio — selección de rol</w:t>
+      </w:r>
+    </w:p>
+    <w:p>
+      <w:pPr>
+        <w:spacing w:before="160" w:after="80"/>
+        <w:jc w:val="center"/>
+      </w:pPr>
+      <w:r>
+        <w:rPr>
+          <w:noProof/>
+        </w:rPr>
+        <w:lastRenderedPageBreak/>
+        <w:drawing>
+          <wp:inline distT="0" distB="0" distL="0" distR="0" wp14:anchorId="33950C69" wp14:editId="7809F162">
+            <wp:extent cx="4762500" cy="2981325"/>
+            <wp:effectExtent l="0" t="0" r="0" b="0"/>
+            <wp:docPr id="448701927" name="Figura 2. Pantalla de inicio con rol Host seleccionado" descr="Figura 2. Pantalla de inicio con rol Host seleccionado" title="Figura 2. Pantalla de inicio con rol Host seleccionado"/>
+            <wp:cNvGraphicFramePr>
+              <a:graphicFrameLocks xmlns:a="http://schemas.openxmlformats.org/drawingml/2006/main" noChangeAspect="1"/>
+            </wp:cNvGraphicFramePr>
+            <a:graphic xmlns:a="http://schemas.openxmlformats.org/drawingml/2006/main">
+              <a:graphicData uri="http://schemas.openxmlformats.org/drawingml/2006/picture">
+                <pic:pic xmlns:pic="http://schemas.openxmlformats.org/drawingml/2006/picture">
+                  <pic:nvPicPr>
+                    <pic:cNvPr id="0" name=""/>
+                    <pic:cNvPicPr>
+                      <a:picLocks noChangeAspect="1" noChangeArrowheads="1"/>
+                    </pic:cNvPicPr>
+                  </pic:nvPicPr>
+                  <pic:blipFill>
+                    <a:blip r:embed="rId12"/>
+                    <a:srcRect/>
+                    <a:stretch>
+                      <a:fillRect/>
+                    </a:stretch>
+                  </pic:blipFill>
+                  <pic:spPr bwMode="auto">
+                    <a:xfrm>
+                      <a:off x="0" y="0"/>
+                      <a:ext cx="4762500" cy="2981325"/>
+                    </a:xfrm>
+                    <a:prstGeom prst="rect">
+                      <a:avLst/>
+                    </a:prstGeom>
+                  </pic:spPr>
+                </pic:pic>
+              </a:graphicData>
+            </a:graphic>
+          </wp:inline>
+        </w:drawing>
+      </w:r>
+    </w:p>
+    <w:p>
+      <w:pPr>
+        <w:spacing w:after="240"/>
+        <w:jc w:val="center"/>
+      </w:pPr>
+      <w:r>
+        <w:rPr>
+          <w:i/>
+          <w:iCs/>
+          <w:color w:val="555555"/>
+          <w:sz w:val="20"/>
+          <w:szCs w:val="20"/>
+        </w:rPr>
+        <w:t>Figura 2. Pantalla de inicio con rol Host seleccionado</w:t>
+      </w:r>
+    </w:p>
+    <w:p>
+      <w:pPr>
+        <w:pStyle w:val="Ttulo2"/>
+      </w:pPr>
+      <w:bookmarkStart w:id="15" w:name="_Toc230890372"/>
+      <w:r>
+        <w:t>3.3 Vista del Host Durante el Juego</w:t>
+      </w:r>
+      <w:bookmarkEnd w:id="15"/>
+    </w:p>
+    <w:p>
+      <w:pPr>
+        <w:spacing w:line="480" w:lineRule="auto"/>
+        <w:jc w:val="both"/>
+      </w:pPr>
+      <w:r>
+        <w:t>El panel de control del host muestra la pregunta actual, el temporizador en cuenta regresiva, el estado de respuesta de cada jugador y el marcador en tiempo real. El botón de avance se activa automáticamente cuando todos los jugadores han respondido o cuando el tiempo se agota.</w:t>
+      </w:r>
+    </w:p>
+    <w:p>
+      <w:pPr>
+        <w:spacing w:line="480" w:lineRule="auto"/>
+      </w:pPr>
+    </w:p>
+    <w:p>
+      <w:pPr>
+        <w:spacing w:before="160" w:after="80"/>
+        <w:jc w:val="center"/>
+      </w:pPr>
+      <w:r>
+        <w:rPr>
+          <w:noProof/>
+        </w:rPr>
+        <w:lastRenderedPageBreak/>
+        <w:drawing>
+          <wp:inline distT="0" distB="0" distL="0" distR="0" wp14:anchorId="5D5589E9" wp14:editId="35989493">
+            <wp:extent cx="5334000" cy="3619500"/>
+            <wp:effectExtent l="0" t="0" r="0" b="0"/>
+            <wp:docPr id="1407841721" name="Figura 6. Sala del host con un jugador conectado" descr="Figura 6. Sala del host con un jugador conectado" title="Figura 6. Sala del host con un jugador conectado"/>
+            <wp:cNvGraphicFramePr>
+              <a:graphicFrameLocks xmlns:a="http://schemas.openxmlformats.org/drawingml/2006/main" noChangeAspect="1"/>
+            </wp:cNvGraphicFramePr>
+            <a:graphic xmlns:a="http://schemas.openxmlformats.org/drawingml/2006/main">
+              <a:graphicData uri="http://schemas.openxmlformats.org/drawingml/2006/picture">
+                <pic:pic xmlns:pic="http://schemas.openxmlformats.org/drawingml/2006/picture">
+                  <pic:nvPicPr>
+                    <pic:cNvPr id="0" name=""/>
+                    <pic:cNvPicPr>
+                      <a:picLocks noChangeAspect="1" noChangeArrowheads="1"/>
+                    </pic:cNvPicPr>
+                  </pic:nvPicPr>
+                  <pic:blipFill>
+                    <a:blip r:embed="rId16"/>
+                    <a:srcRect/>
+                    <a:stretch>
+                      <a:fillRect/>
+                    </a:stretch>
+                  </pic:blipFill>
+                  <pic:spPr bwMode="auto">
+                    <a:xfrm>
+                      <a:off x="0" y="0"/>
+                      <a:ext cx="5334000" cy="3619500"/>
+                    </a:xfrm>
+                    <a:prstGeom prst="rect">
+                      <a:avLst/>
+                    </a:prstGeom>
+                  </pic:spPr>
+                </pic:pic>
+              </a:graphicData>
+            </a:graphic>
+          </wp:inline>
+        </w:drawing>
+      </w:r>
+    </w:p>
+    <w:p>
+      <w:pPr>
+        <w:spacing w:after="240"/>
+        <w:jc w:val="center"/>
+      </w:pPr>
+      <w:r>
+        <w:rPr>
+          <w:i/>
+          <w:iCs/>
+          <w:color w:val="555555"/>
+          <w:sz w:val="20"/>
+          <w:szCs w:val="20"/>
+        </w:rPr>
+        <w:t>Figura 6. Sala del host con un jugador conectado</w:t>
+      </w:r>
+    </w:p>
+    <w:p>
+      <w:pPr>
+        <w:spacing w:before="160" w:after="80"/>
+        <w:jc w:val="center"/>
+      </w:pPr>
+      <w:r>
+        <w:rPr>
+          <w:noProof/>
+        </w:rPr>
+        <w:drawing>
+          <wp:inline distT="0" distB="0" distL="0" distR="0" wp14:anchorId="39889894" wp14:editId="4852430D">
+            <wp:extent cx="5334000" cy="3429000"/>
+            <wp:effectExtent l="0" t="0" r="0" b="0"/>
+            <wp:docPr id="26690484" name="Figura 7. Dashboard del host durante Time Machine (Past Simple)" descr="Figura 7. Dashboard del host durante Time Machine (Past Simple)" title="Figura 7. Dashboard del host durante Time Machine (Past Simple)"/>
+            <wp:cNvGraphicFramePr>
+              <a:graphicFrameLocks xmlns:a="http://schemas.openxmlformats.org/drawingml/2006/main" noChangeAspect="1"/>
+            </wp:cNvGraphicFramePr>
+            <a:graphic xmlns:a="http://schemas.openxmlformats.org/drawingml/2006/main">
+              <a:graphicData uri="http://schemas.openxmlformats.org/drawingml/2006/picture">
+                <pic:pic xmlns:pic="http://schemas.openxmlformats.org/drawingml/2006/picture">
+                  <pic:nvPicPr>
+                    <pic:cNvPr id="0" name=""/>
+                    <pic:cNvPicPr>
+                      <a:picLocks noChangeAspect="1" noChangeArrowheads="1"/>
+                    </pic:cNvPicPr>
+                  </pic:nvPicPr>
+                  <pic:blipFill>
+                    <a:blip r:embed="rId17"/>
+                    <a:srcRect/>
+                    <a:stretch>
+                      <a:fillRect/>
+                    </a:stretch>
+                  </pic:blipFill>
+                  <pic:spPr bwMode="auto">
+                    <a:xfrm>
+                      <a:off x="0" y="0"/>
+                      <a:ext cx="5334000" cy="3429000"/>
+                    </a:xfrm>
+                    <a:prstGeom prst="rect">
+                      <a:avLst/>
+                    </a:prstGeom>
+                  </pic:spPr>
+                </pic:pic>
+              </a:graphicData>
+            </a:graphic>
+          </wp:inline>
+        </w:drawing>
+      </w:r>
+    </w:p>
+    <w:p>
+      <w:pPr>
+        <w:spacing w:after="240"/>
+        <w:jc w:val="center"/>
+      </w:pPr>
+      <w:r>
+        <w:rPr>
+          <w:i/>
+          <w:iCs/>
+          <w:color w:val="555555"/>
+          <w:sz w:val="20"/>
+          <w:szCs w:val="20"/>
+        </w:rPr>
+        <w:t xml:space="preserve">Figura 7. </w:t>
+      </w:r>
+      <w:proofErr w:type="spellStart"/>
+      <w:r>
+        <w:rPr>
+          <w:i/>
+          <w:iCs/>
+          <w:color w:val="555555"/>
+          <w:sz w:val="20"/>
+          <w:szCs w:val="20"/>
+        </w:rPr>
+        <w:t>Dashboard</w:t>
+      </w:r>
+      <w:proofErr w:type="spellEnd"/>
+      <w:r>
+        <w:rPr>
+          <w:i/>
+          <w:iCs/>
+          <w:color w:val="555555"/>
+          <w:sz w:val="20"/>
+          <w:szCs w:val="20"/>
+        </w:rPr>
+        <w:t xml:space="preserve"> del host durante Time Machine (Past Simple)</w:t>
+      </w:r>
+    </w:p>
+    <w:p>
+      <w:pPr>
+        <w:pStyle w:val="Ttulo2"/>
+      </w:pPr>
+      <w:bookmarkStart w:id="16" w:name="_Toc230890373"/>
+      <w:r>
+        <w:t>3.4 Vista del Jugador Durante el Juego</w:t>
+      </w:r>
+      <w:bookmarkEnd w:id="16"/>
+    </w:p>
+    <w:p>
+      <w:pPr>
+        <w:spacing w:line="480" w:lineRule="auto"/>
+        <w:jc w:val="both"/>
+      </w:pPr>
+      <w:r>
+        <w:lastRenderedPageBreak/>
+        <w:t>La vista del jugador se adapta a dispositivos móviles con un diseño vertical optimizado. En Time Machine, el jugador ve las palabras mezcladas como fichas interactivas y debe tocarlas en el orden correcto para formar la oración. Un temporizador visible en la parte superior indica el tiempo restante para responder.</w:t>
+      </w:r>
+    </w:p>
+    <w:p>
+      <w:pPr>
+        <w:spacing w:line="480" w:lineRule="auto"/>
+      </w:pPr>
+    </w:p>
+    <w:p>
+      <w:pPr>
+        <w:spacing w:before="160" w:after="80"/>
+        <w:jc w:val="center"/>
+      </w:pPr>
+      <w:r>
+        <w:rPr>
+          <w:noProof/>
+        </w:rPr>
+        <w:drawing>
+          <wp:inline distT="0" distB="0" distL="0" distR="0" wp14:anchorId="16E32909" wp14:editId="23A9F38C">
+            <wp:extent cx="2476500" cy="5381625"/>
+            <wp:effectExtent l="0" t="0" r="0" b="0"/>
+            <wp:docPr id="1125636132" name="Figura 8. Vista del jugador en Time Machine (palabras sin ordenar)" descr="Figura 8. Vista del jugador en Time Machine (palabras sin ordenar)" title="Figura 8. Vista del jugador en Time Machine (palabras sin ordenar)"/>
+            <wp:cNvGraphicFramePr>
+              <a:graphicFrameLocks xmlns:a="http://schemas.openxmlformats.org/drawingml/2006/main" noChangeAspect="1"/>
+            </wp:cNvGraphicFramePr>
+            <a:graphic xmlns:a="http://schemas.openxmlformats.org/drawingml/2006/main">
+              <a:graphicData uri="http://schemas.openxmlformats.org/drawingml/2006/picture">
+                <pic:pic xmlns:pic="http://schemas.openxmlformats.org/drawingml/2006/picture">
+                  <pic:nvPicPr>
+                    <pic:cNvPr id="0" name=""/>
+                    <pic:cNvPicPr>
+                      <a:picLocks noChangeAspect="1" noChangeArrowheads="1"/>
+                    </pic:cNvPicPr>
+                  </pic:nvPicPr>
+                  <pic:blipFill>
+                    <a:blip r:embed="rId18"/>
+                    <a:srcRect/>
+                    <a:stretch>
+                      <a:fillRect/>
+                    </a:stretch>
+                  </pic:blipFill>
+                  <pic:spPr bwMode="auto">
+                    <a:xfrm>
+                      <a:off x="0" y="0"/>
+                      <a:ext cx="2476500" cy="5381625"/>
+                    </a:xfrm>
+                    <a:prstGeom prst="rect">
+                      <a:avLst/>
+                    </a:prstGeom>
+                  </pic:spPr>
+                </pic:pic>
+              </a:graphicData>
+            </a:graphic>
+          </wp:inline>
+        </w:drawing>
+      </w:r>
+    </w:p>
+    <w:p>
+      <w:pPr>
+        <w:spacing w:after="240"/>
+        <w:jc w:val="center"/>
+      </w:pPr>
+      <w:r>
+        <w:rPr>
+          <w:i/>
+          <w:iCs/>
+          <w:color w:val="555555"/>
+          <w:sz w:val="20"/>
+          <w:szCs w:val="20"/>
+        </w:rPr>
+        <w:t>Figura 8. Vista del jugador en Time Machine (palabras sin ordenar)</w:t>
+      </w:r>
+    </w:p>
+    <w:p>
+      <w:pPr>
+        <w:spacing w:before="160" w:after="80"/>
+        <w:jc w:val="center"/>
+      </w:pPr>
+      <w:r>
+        <w:rPr>
+          <w:noProof/>
+        </w:rPr>
+        <w:lastRenderedPageBreak/>
+        <w:drawing>
+          <wp:inline distT="0" distB="0" distL="0" distR="0" wp14:anchorId="49F0FAF4" wp14:editId="3CD84C37">
+            <wp:extent cx="2476500" cy="5381625"/>
+            <wp:effectExtent l="0" t="0" r="0" b="0"/>
+            <wp:docPr id="1528622472" name="Figura 9. Jugador colocando palabras en el orden correcto" descr="Figura 9. Jugador colocando palabras en el orden correcto" title="Figura 9. Jugador colocando palabras en el orden correcto"/>
+            <wp:cNvGraphicFramePr>
+              <a:graphicFrameLocks xmlns:a="http://schemas.openxmlformats.org/drawingml/2006/main" noChangeAspect="1"/>
+            </wp:cNvGraphicFramePr>
+            <a:graphic xmlns:a="http://schemas.openxmlformats.org/drawingml/2006/main">
+              <a:graphicData uri="http://schemas.openxmlformats.org/drawingml/2006/picture">
+                <pic:pic xmlns:pic="http://schemas.openxmlformats.org/drawingml/2006/picture">
+                  <pic:nvPicPr>
+                    <pic:cNvPr id="0" name=""/>
+                    <pic:cNvPicPr>
+                      <a:picLocks noChangeAspect="1" noChangeArrowheads="1"/>
+                    </pic:cNvPicPr>
+                  </pic:nvPicPr>
+                  <pic:blipFill>
+                    <a:blip r:embed="rId19"/>
+                    <a:srcRect/>
+                    <a:stretch>
+                      <a:fillRect/>
+                    </a:stretch>
+                  </pic:blipFill>
+                  <pic:spPr bwMode="auto">
+                    <a:xfrm>
+                      <a:off x="0" y="0"/>
+                      <a:ext cx="2476500" cy="5381625"/>
+                    </a:xfrm>
+                    <a:prstGeom prst="rect">
+                      <a:avLst/>
+                    </a:prstGeom>
+                  </pic:spPr>
+                </pic:pic>
+              </a:graphicData>
+            </a:graphic>
+          </wp:inline>
+        </w:drawing>
+      </w:r>
+    </w:p>
+    <w:p>
+      <w:pPr>
+        <w:spacing w:after="240"/>
+        <w:jc w:val="center"/>
+      </w:pPr>
+      <w:r>
+        <w:rPr>
+          <w:i/>
+          <w:iCs/>
+          <w:color w:val="555555"/>
+          <w:sz w:val="20"/>
+          <w:szCs w:val="20"/>
+        </w:rPr>
+        <w:t>Figura 9. Jugador colocando palabras en el orden correcto</w:t>
+      </w:r>
+    </w:p>
+    <w:p>
+      <w:pPr>
+        <w:pStyle w:val="Ttulo2"/>
+      </w:pPr>
+      <w:bookmarkStart w:id="17" w:name="_Toc230890374"/>
+      <w:r>
+        <w:t>3.5 Resultados Finales</w:t>
+      </w:r>
+      <w:bookmarkEnd w:id="17"/>
+    </w:p>
+    <w:p>
+      <w:pPr>
+        <w:spacing w:line="480" w:lineRule="auto"/>
+        <w:jc w:val="both"/>
+      </w:pPr>
+      <w:r>
+        <w:t>Al concluir todas las rondas, el host ve la pantalla de resultados con el podio de ganadores y las puntuaciones finales. Los jugadores reciben simultáneamente la notificación de fin de juego con su puntuación total. El host puede iniciar una nueva partida o cerrar la sesión.</w:t>
+      </w:r>
+    </w:p>
+    <w:p>
+      <w:pPr>
+        <w:spacing w:line="480" w:lineRule="auto"/>
+      </w:pPr>
+    </w:p>
+    <w:p>
+      <w:pPr>
+        <w:spacing w:before="160" w:after="80"/>
+        <w:jc w:val="center"/>
+      </w:pPr>
+      <w:r>
+        <w:rPr>
+          <w:noProof/>
+        </w:rPr>
+        <w:lastRenderedPageBreak/>
+        <w:drawing>
+          <wp:inline distT="0" distB="0" distL="0" distR="0" wp14:anchorId="50F0B132" wp14:editId="3CCAB57D">
+            <wp:extent cx="5334000" cy="3429000"/>
+            <wp:effectExtent l="0" t="0" r="0" b="0"/>
+            <wp:docPr id="1271512881" name="Figura 10. Pantalla de resultados finales — vista del host" descr="Figura 10. Pantalla de resultados finales — vista del host" title="Figura 10. Pantalla de resultados finales — vista del host"/>
+            <wp:cNvGraphicFramePr>
+              <a:graphicFrameLocks xmlns:a="http://schemas.openxmlformats.org/drawingml/2006/main" noChangeAspect="1"/>
+            </wp:cNvGraphicFramePr>
+            <a:graphic xmlns:a="http://schemas.openxmlformats.org/drawingml/2006/main">
+              <a:graphicData uri="http://schemas.openxmlformats.org/drawingml/2006/picture">
+                <pic:pic xmlns:pic="http://schemas.openxmlformats.org/drawingml/2006/picture">
+                  <pic:nvPicPr>
+                    <pic:cNvPr id="0" name=""/>
+                    <pic:cNvPicPr>
+                      <a:picLocks noChangeAspect="1" noChangeArrowheads="1"/>
+                    </pic:cNvPicPr>
+                  </pic:nvPicPr>
+                  <pic:blipFill>
+                    <a:blip r:embed="rId20"/>
+                    <a:srcRect/>
+                    <a:stretch>
+                      <a:fillRect/>
+                    </a:stretch>
+                  </pic:blipFill>
+                  <pic:spPr bwMode="auto">
+                    <a:xfrm>
+                      <a:off x="0" y="0"/>
+                      <a:ext cx="5334000" cy="3429000"/>
+                    </a:xfrm>
+                    <a:prstGeom prst="rect">
+                      <a:avLst/>
+                    </a:prstGeom>
+                  </pic:spPr>
+                </pic:pic>
+              </a:graphicData>
+            </a:graphic>
+          </wp:inline>
+        </w:drawing>
+      </w:r>
+    </w:p>
+    <w:p>
+      <w:pPr>
+        <w:spacing w:after="240"/>
+        <w:jc w:val="center"/>
+      </w:pPr>
+      <w:r>
+        <w:rPr>
+          <w:i/>
+          <w:iCs/>
+          <w:color w:val="555555"/>
+          <w:sz w:val="20"/>
+          <w:szCs w:val="20"/>
+        </w:rPr>
+        <w:t>Figura 10. Pantalla de resultados finales — vista del host</w:t>
+      </w:r>
+    </w:p>
+    <w:p>
+      <w:pPr>
+        <w:spacing w:before="160" w:after="80"/>
+        <w:jc w:val="center"/>
+      </w:pPr>
+      <w:r>
+        <w:rPr>
+          <w:noProof/>
+        </w:rPr>
+        <w:lastRenderedPageBreak/>
+        <w:drawing>
+          <wp:inline distT="0" distB="0" distL="0" distR="0" wp14:anchorId="47A14C95" wp14:editId="1203D79C">
+            <wp:extent cx="2476500" cy="5381625"/>
+            <wp:effectExtent l="0" t="0" r="0" b="0"/>
+            <wp:docPr id="12659428" name="Figura 11. Pantalla de fin de juego — vista del jugador (móvil)" descr="Figura 11. Pantalla de fin de juego — vista del jugador (móvil)" title="Figura 11. Pantalla de fin de juego — vista del jugador (móvil)"/>
+            <wp:cNvGraphicFramePr>
+              <a:graphicFrameLocks xmlns:a="http://schemas.openxmlformats.org/drawingml/2006/main" noChangeAspect="1"/>
+            </wp:cNvGraphicFramePr>
+            <a:graphic xmlns:a="http://schemas.openxmlformats.org/drawingml/2006/main">
+              <a:graphicData uri="http://schemas.openxmlformats.org/drawingml/2006/picture">
+                <pic:pic xmlns:pic="http://schemas.openxmlformats.org/drawingml/2006/picture">
+                  <pic:nvPicPr>
+                    <pic:cNvPr id="0" name=""/>
+                    <pic:cNvPicPr>
+                      <a:picLocks noChangeAspect="1" noChangeArrowheads="1"/>
+                    </pic:cNvPicPr>
+                  </pic:nvPicPr>
+                  <pic:blipFill>
+                    <a:blip r:embed="rId21"/>
+                    <a:srcRect/>
+                    <a:stretch>
+                      <a:fillRect/>
+                    </a:stretch>
+                  </pic:blipFill>
+                  <pic:spPr bwMode="auto">
+                    <a:xfrm>
+                      <a:off x="0" y="0"/>
+                      <a:ext cx="2476500" cy="5381625"/>
+                    </a:xfrm>
+                    <a:prstGeom prst="rect">
+                      <a:avLst/>
+                    </a:prstGeom>
+                  </pic:spPr>
+                </pic:pic>
+              </a:graphicData>
+            </a:graphic>
+          </wp:inline>
+        </w:drawing>
+      </w:r>
+    </w:p>
+    <w:p>
+      <w:pPr>
+        <w:spacing w:after="240"/>
+        <w:jc w:val="center"/>
+      </w:pPr>
+      <w:r>
+        <w:rPr>
+          <w:i/>
+          <w:iCs/>
+          <w:color w:val="555555"/>
+          <w:sz w:val="20"/>
+          <w:szCs w:val="20"/>
+        </w:rPr>
+        <w:t>Figura 11. Pantalla de fin de juego — vista del jugador (móvil)</w:t>
+      </w:r>
+    </w:p>
+    <w:p>
+      <w:pPr>
+        <w:pStyle w:val="Ttulo1"/>
+        <w:pageBreakBefore/>
+      </w:pPr>
       <w:bookmarkStart w:id="18" w:name="_Toc230890375"/>
       <w:r>
         <w:rPr>
           <w:caps/>
         </w:rPr>
         <w:lastRenderedPageBreak/>
-        <w:t>3. Conclusión</w:t>
+        <w:t>4. Conclusión</w:t>
       </w:r>
       <w:bookmarkEnd w:id="18"/>
     </w:p>

</xml_diff>